<commit_message>
Updated Introduction with references
</commit_message>
<xml_diff>
--- a/Project-Report-Outline.docx
+++ b/Project-Report-Outline.docx
@@ -35,10 +35,10 @@
       </w:pPr>
     </w:p>
     <w:bookmarkEnd w:id="21"/>
-    <w:bookmarkStart w:id="36" w:name="introduction"/>
-    <w:p>
-      <w:pPr>
-        <w:pStyle w:val="Heading1"/>
+    <w:bookmarkStart w:id="22" w:name="introduction"/>
+    <w:p>
+      <w:pPr>
+        <w:pStyle w:val="Heading2"/>
       </w:pPr>
       <w:r>
         <w:rPr>
@@ -100,9 +100,11 @@
         <w:t xml:space="preserve">. To understand why this data matters, it helps to know the bigger picture: what invasive species are, how New York State organizes its response, and what official plans guide decisions about which species to focus on.</w:t>
       </w:r>
     </w:p>
-    <w:p>
-      <w:pPr>
-        <w:pStyle w:val="BodyText"/>
+    <w:bookmarkEnd w:id="22"/>
+    <w:bookmarkStart w:id="23" w:name="background-on-invasive-species"/>
+    <w:p>
+      <w:pPr>
+        <w:pStyle w:val="Heading2"/>
       </w:pPr>
       <w:r>
         <w:t xml:space="preserve">Background on Invasive Species</w:t>
@@ -110,7 +112,7 @@
     </w:p>
     <w:p>
       <w:pPr>
-        <w:pStyle w:val="BodyText"/>
+        <w:pStyle w:val="FirstParagraph"/>
       </w:pPr>
       <w:r>
         <w:t xml:space="preserve">At its most basic, an invasive species is any organism — plant, animal, insect, fungus, or microbe — that establishes itself outside its native range and causes meaningful harm to the environment, economy, or human health</w:t>
@@ -293,7 +295,55 @@
         <w:t xml:space="preserve">(Gentili et al. 2021; Mack et al. 2000)</w:t>
       </w:r>
       <w:r>
-        <w:t xml:space="preserve">. Invasive species can also carry parasites and pathogens that spill over into native wildlife, compounding the damage further</w:t>
+        <w:t xml:space="preserve">. Invasive species can also carry parasites and pathogens that spill over into native wildlife, compounding the damage furtherndefined [</w:t>
+      </w:r>
+      <w:r>
+        <w:t xml:space="preserve">(</w:t>
+      </w:r>
+      <w:r>
+        <w:rPr>
+          <w:b/>
+          <w:bCs/>
+        </w:rPr>
+        <w:t xml:space="preserve">us?</w:t>
+      </w:r>
+      <w:r>
+        <w:t xml:space="preserve">)</w:t>
+      </w:r>
+    </w:p>
+    <w:p>
+      <w:pPr>
+        <w:pStyle w:val="BodyText"/>
+      </w:pPr>
+      <w:r>
+        <w:t xml:space="preserve">Beyond the ecological toll, invasive species impose enormous economic costs</w:t>
+      </w:r>
+      <w:r>
+        <w:t xml:space="preserve"> </w:t>
+      </w:r>
+      <w:r>
+        <w:t xml:space="preserve">(Diagne et al. 2021)</w:t>
+      </w:r>
+      <w:r>
+        <w:t xml:space="preserve">. Agricultural industries lose billions of dollars annually to crop damage from invasive pests and weeds</w:t>
+      </w:r>
+      <w:r>
+        <w:t xml:space="preserve"> </w:t>
+      </w:r>
+      <w:r>
+        <w:t xml:space="preserve">(Diagne et al. 2021)</w:t>
+      </w:r>
+      <w:r>
+        <w:t xml:space="preserve">. Forestry operations contend with invasive insects and diseases that kill commercially valuable trees</w:t>
+      </w:r>
+      <w:r>
+        <w:t xml:space="preserve"> </w:t>
+      </w:r>
+      <w:r>
+        <w:t xml:space="preserve">(Mack et al. 2000)</w:t>
+      </w:r>
+      <w:r>
+        <w:t xml:space="preserve">. Water infrastructure is disrupted by organisms like zebra mussels that clog intake pipes and alter aquatic chemistry</w:t>
       </w:r>
       <w:r>
         <w:t xml:space="preserve"> </w:t>
@@ -302,50 +352,6 @@
         <w:t xml:space="preserve">(United States Department of Agriculture 2024)</w:t>
       </w:r>
       <w:r>
-        <w:t xml:space="preserve">.</w:t>
-      </w:r>
-    </w:p>
-    <w:p>
-      <w:pPr>
-        <w:pStyle w:val="BodyText"/>
-      </w:pPr>
-      <w:r>
-        <w:t xml:space="preserve">Beyond the ecological toll, invasive species impose enormous economic costs</w:t>
-      </w:r>
-      <w:r>
-        <w:t xml:space="preserve"> </w:t>
-      </w:r>
-      <w:r>
-        <w:t xml:space="preserve">(Diagne et al. 2021)</w:t>
-      </w:r>
-      <w:r>
-        <w:t xml:space="preserve">. Agricultural industries lose billions of dollars annually to crop damage from invasive pests and weeds</w:t>
-      </w:r>
-      <w:r>
-        <w:t xml:space="preserve"> </w:t>
-      </w:r>
-      <w:r>
-        <w:t xml:space="preserve">(Diagne et al. 2021)</w:t>
-      </w:r>
-      <w:r>
-        <w:t xml:space="preserve">. Forestry operations contend with invasive insects and diseases that kill commercially valuable trees</w:t>
-      </w:r>
-      <w:r>
-        <w:t xml:space="preserve"> </w:t>
-      </w:r>
-      <w:r>
-        <w:t xml:space="preserve">(Mack et al. 2000)</w:t>
-      </w:r>
-      <w:r>
-        <w:t xml:space="preserve">. Water infrastructure is disrupted by organisms like zebra mussels that clog intake pipes and alter aquatic chemistry</w:t>
-      </w:r>
-      <w:r>
-        <w:t xml:space="preserve"> </w:t>
-      </w:r>
-      <w:r>
-        <w:t xml:space="preserve">(United States Department of Agriculture 2024)</w:t>
-      </w:r>
-      <w:r>
         <w:t xml:space="preserve">. And the cost of active management — detection, treatment, removal, and restoration — adds yet another layer to the financial burden</w:t>
       </w:r>
       <w:r>
@@ -420,9 +426,11 @@
         <w:t xml:space="preserve">.</w:t>
       </w:r>
     </w:p>
-    <w:p>
-      <w:pPr>
-        <w:pStyle w:val="BodyText"/>
+    <w:bookmarkEnd w:id="23"/>
+    <w:bookmarkStart w:id="24" w:name="X66ba1014368c31aee049b2bc1afbf0f32e2e188"/>
+    <w:p>
+      <w:pPr>
+        <w:pStyle w:val="Heading2"/>
       </w:pPr>
       <w:r>
         <w:t xml:space="preserve">Background on NYS DEC Invasive Species Programs and the PRISM System</w:t>
@@ -430,7 +438,7 @@
     </w:p>
     <w:p>
       <w:pPr>
-        <w:pStyle w:val="BodyText"/>
+        <w:pStyle w:val="FirstParagraph"/>
       </w:pPr>
       <w:r>
         <w:t xml:space="preserve">The New York State Department of Environmental Conservation (DEC) works with many groups — such as resource managers, non-profit organizations, industry workers, recreation groups, and other state agencies — to deal with invasive species</w:t>
@@ -507,9 +515,11 @@
         <w:t xml:space="preserve">.</w:t>
       </w:r>
     </w:p>
-    <w:p>
-      <w:pPr>
-        <w:pStyle w:val="BodyText"/>
+    <w:bookmarkEnd w:id="24"/>
+    <w:bookmarkStart w:id="25" w:name="X8640c08d6f37e7864e32c89ffe58d6a0d55282a"/>
+    <w:p>
+      <w:pPr>
+        <w:pStyle w:val="Heading2"/>
       </w:pPr>
       <w:r>
         <w:t xml:space="preserve">PRISMs carry out many important tasks, including:</w:t>
@@ -517,7 +527,7 @@
     </w:p>
     <w:p>
       <w:pPr>
-        <w:pStyle w:val="BodyText"/>
+        <w:pStyle w:val="FirstParagraph"/>
       </w:pPr>
       <w:r>
         <w:t xml:space="preserve">Planning invasive species management for their region</w:t>
@@ -700,9 +710,11 @@
         <w:t xml:space="preserve">.</w:t>
       </w:r>
     </w:p>
-    <w:p>
-      <w:pPr>
-        <w:pStyle w:val="BodyText"/>
+    <w:bookmarkEnd w:id="25"/>
+    <w:bookmarkStart w:id="26" w:name="prisms-deliver"/>
+    <w:p>
+      <w:pPr>
+        <w:pStyle w:val="Heading2"/>
       </w:pPr>
       <w:r>
         <w:t xml:space="preserve">PRISMs deliver:</w:t>
@@ -710,7 +722,7 @@
     </w:p>
     <w:p>
       <w:pPr>
-        <w:pStyle w:val="BodyText"/>
+        <w:pStyle w:val="FirstParagraph"/>
       </w:pPr>
       <w:r>
         <w:t xml:space="preserve">Regional planning for invasive species management</w:t>
@@ -867,9 +879,11 @@
         <w:t xml:space="preserve">.</w:t>
       </w:r>
     </w:p>
-    <w:p>
-      <w:pPr>
-        <w:pStyle w:val="BodyText"/>
+    <w:bookmarkEnd w:id="26"/>
+    <w:bookmarkStart w:id="27" w:name="X9a324f50f523f905e6f7ca808b874e927f49fa7"/>
+    <w:p>
+      <w:pPr>
+        <w:pStyle w:val="Heading2"/>
       </w:pPr>
       <w:r>
         <w:t xml:space="preserve">Information and Background on the NYS Invasive Species Lists</w:t>
@@ -877,7 +891,7 @@
     </w:p>
     <w:p>
       <w:pPr>
-        <w:pStyle w:val="BodyText"/>
+        <w:pStyle w:val="FirstParagraph"/>
       </w:pPr>
       <w:r>
         <w:t xml:space="preserve">Not every non-native species that shows up in New York needs immediate action</w:t>
@@ -1110,14 +1124,417 @@
         <w:t xml:space="preserve">.</w:t>
       </w:r>
     </w:p>
-    <w:bookmarkStart w:id="35" w:name="section-1"/>
+    <w:bookmarkEnd w:id="27"/>
+    <w:bookmarkStart w:id="36" w:name="references"/>
     <w:p>
       <w:pPr>
         <w:pStyle w:val="Heading2"/>
       </w:pPr>
-    </w:p>
-    <w:bookmarkStart w:id="34" w:name="refs"/>
-    <w:bookmarkStart w:id="22" w:name="ref-diagne2021"/>
+      <w:r>
+        <w:t xml:space="preserve">References</w:t>
+      </w:r>
+    </w:p>
+    <w:p>
+      <w:pPr>
+        <w:pStyle w:val="FirstParagraph"/>
+      </w:pPr>
+      <w:r>
+        <w:t xml:space="preserve">Gentili, R., et al. (2021).</w:t>
+      </w:r>
+      <w:r>
+        <w:t xml:space="preserve"> </w:t>
+      </w:r>
+      <w:r>
+        <w:rPr>
+          <w:i/>
+          <w:iCs/>
+        </w:rPr>
+        <w:t xml:space="preserve">Invasive alien species and ecosystem services: A systematic review</w:t>
+      </w:r>
+      <w:r>
+        <w:t xml:space="preserve">.</w:t>
+      </w:r>
+      <w:r>
+        <w:t xml:space="preserve"> </w:t>
+      </w:r>
+      <w:r>
+        <w:rPr>
+          <w:b/>
+          <w:bCs/>
+        </w:rPr>
+        <w:t xml:space="preserve">Global Ecology and Conservation</w:t>
+      </w:r>
+      <w:r>
+        <w:t xml:space="preserve">.</w:t>
+      </w:r>
+      <w:r>
+        <w:br/>
+      </w:r>
+      <w:hyperlink r:id="rId28">
+        <w:r>
+          <w:rPr>
+            <w:rStyle w:val="Hyperlink"/>
+          </w:rPr>
+          <w:t xml:space="preserve">https://www.sciencedirect.com/science/article/pii/S235198942100007X</w:t>
+        </w:r>
+      </w:hyperlink>
+    </w:p>
+    <w:p>
+      <w:pPr>
+        <w:pStyle w:val="BodyText"/>
+      </w:pPr>
+      <w:r>
+        <w:t xml:space="preserve">Mack, R. N., et al. (2000).</w:t>
+      </w:r>
+      <w:r>
+        <w:t xml:space="preserve"> </w:t>
+      </w:r>
+      <w:r>
+        <w:rPr>
+          <w:i/>
+          <w:iCs/>
+        </w:rPr>
+        <w:t xml:space="preserve">Biotic invasions: Causes, epidemiology, global consequences, and control</w:t>
+      </w:r>
+      <w:r>
+        <w:t xml:space="preserve">.</w:t>
+      </w:r>
+      <w:r>
+        <w:t xml:space="preserve"> </w:t>
+      </w:r>
+      <w:r>
+        <w:rPr>
+          <w:b/>
+          <w:bCs/>
+        </w:rPr>
+        <w:t xml:space="preserve">Ecological Applications</w:t>
+      </w:r>
+      <w:r>
+        <w:t xml:space="preserve">.</w:t>
+      </w:r>
+      <w:r>
+        <w:br/>
+      </w:r>
+      <w:r>
+        <w:t xml:space="preserve">https://esajournals.onlinelibrary.wiley.com/doi/10.1890/1051-0761(2000)010[0689:BICEGC]2.0.CO;2</w:t>
+      </w:r>
+    </w:p>
+    <w:p>
+      <w:pPr>
+        <w:pStyle w:val="BodyText"/>
+      </w:pPr>
+      <w:r>
+        <w:t xml:space="preserve">Diagne, C., et al. (2021).</w:t>
+      </w:r>
+      <w:r>
+        <w:t xml:space="preserve"> </w:t>
+      </w:r>
+      <w:r>
+        <w:rPr>
+          <w:i/>
+          <w:iCs/>
+        </w:rPr>
+        <w:t xml:space="preserve">High and rising economic costs of biological invasions worldwide</w:t>
+      </w:r>
+      <w:r>
+        <w:t xml:space="preserve">.</w:t>
+      </w:r>
+      <w:r>
+        <w:t xml:space="preserve"> </w:t>
+      </w:r>
+      <w:r>
+        <w:rPr>
+          <w:b/>
+          <w:bCs/>
+        </w:rPr>
+        <w:t xml:space="preserve">Nature</w:t>
+      </w:r>
+      <w:r>
+        <w:t xml:space="preserve">.</w:t>
+      </w:r>
+      <w:r>
+        <w:br/>
+      </w:r>
+      <w:hyperlink r:id="rId29">
+        <w:r>
+          <w:rPr>
+            <w:rStyle w:val="Hyperlink"/>
+          </w:rPr>
+          <w:t xml:space="preserve">https://www.nature.com/articles/s41586-021-03405-6</w:t>
+        </w:r>
+      </w:hyperlink>
+    </w:p>
+    <w:p>
+      <w:pPr>
+        <w:pStyle w:val="BodyText"/>
+      </w:pPr>
+      <w:r>
+        <w:t xml:space="preserve">Leung, B., et al. (2002).</w:t>
+      </w:r>
+      <w:r>
+        <w:t xml:space="preserve"> </w:t>
+      </w:r>
+      <w:r>
+        <w:rPr>
+          <w:i/>
+          <w:iCs/>
+        </w:rPr>
+        <w:t xml:space="preserve">An ounce of prevention or a pound of cure: Bioeconomic risk analysis of invasive species</w:t>
+      </w:r>
+      <w:r>
+        <w:t xml:space="preserve">.</w:t>
+      </w:r>
+      <w:r>
+        <w:t xml:space="preserve"> </w:t>
+      </w:r>
+      <w:r>
+        <w:rPr>
+          <w:b/>
+          <w:bCs/>
+        </w:rPr>
+        <w:t xml:space="preserve">Proceedings of the Royal Society B</w:t>
+      </w:r>
+      <w:r>
+        <w:t xml:space="preserve">.</w:t>
+      </w:r>
+      <w:r>
+        <w:br/>
+      </w:r>
+      <w:hyperlink r:id="rId30">
+        <w:r>
+          <w:rPr>
+            <w:rStyle w:val="Hyperlink"/>
+          </w:rPr>
+          <w:t xml:space="preserve">https://royalsocietypublishing.org/doi/10.1098/rspb.2002.2179</w:t>
+        </w:r>
+      </w:hyperlink>
+    </w:p>
+    <w:p>
+      <w:pPr>
+        <w:pStyle w:val="BodyText"/>
+      </w:pPr>
+      <w:r>
+        <w:rPr>
+          <w:u w:val="single"/>
+        </w:rPr>
+        <w:t xml:space="preserve">United States Department of Agriculture</w:t>
+      </w:r>
+      <w:r>
+        <w:t xml:space="preserve">. (2024).</w:t>
+      </w:r>
+      <w:r>
+        <w:t xml:space="preserve"> </w:t>
+      </w:r>
+      <w:r>
+        <w:rPr>
+          <w:b/>
+          <w:bCs/>
+          <w:i/>
+          <w:iCs/>
+        </w:rPr>
+        <w:t xml:space="preserve">Invasive Species</w:t>
+      </w:r>
+      <w:r>
+        <w:t xml:space="preserve">.</w:t>
+      </w:r>
+      <w:r>
+        <w:br/>
+      </w:r>
+      <w:hyperlink r:id="rId31">
+        <w:r>
+          <w:rPr>
+            <w:rStyle w:val="Hyperlink"/>
+          </w:rPr>
+          <w:t xml:space="preserve">https://www.usda.gov/topics/invasive-species</w:t>
+        </w:r>
+      </w:hyperlink>
+    </w:p>
+    <w:p>
+      <w:pPr>
+        <w:pStyle w:val="BodyText"/>
+      </w:pPr>
+      <w:r>
+        <w:rPr>
+          <w:u w:val="single"/>
+        </w:rPr>
+        <w:t xml:space="preserve">New York State Department of Environmental Conservation</w:t>
+      </w:r>
+      <w:r>
+        <w:t xml:space="preserve">. (2024).</w:t>
+      </w:r>
+      <w:r>
+        <w:t xml:space="preserve"> </w:t>
+      </w:r>
+      <w:r>
+        <w:rPr>
+          <w:b/>
+          <w:bCs/>
+          <w:i/>
+          <w:iCs/>
+        </w:rPr>
+        <w:t xml:space="preserve">Invasive Species</w:t>
+      </w:r>
+      <w:r>
+        <w:rPr>
+          <w:b/>
+          <w:bCs/>
+        </w:rPr>
+        <w:t xml:space="preserve">.</w:t>
+      </w:r>
+      <w:r>
+        <w:br/>
+      </w:r>
+      <w:hyperlink r:id="rId32">
+        <w:r>
+          <w:rPr>
+            <w:rStyle w:val="Hyperlink"/>
+          </w:rPr>
+          <w:t xml:space="preserve">https://dec.ny.gov/nature/invasive-species</w:t>
+        </w:r>
+      </w:hyperlink>
+    </w:p>
+    <w:p>
+      <w:pPr>
+        <w:pStyle w:val="BodyText"/>
+      </w:pPr>
+      <w:r>
+        <w:rPr>
+          <w:u w:val="single"/>
+        </w:rPr>
+        <w:t xml:space="preserve">New York State Department of Environmental Conservation</w:t>
+      </w:r>
+      <w:r>
+        <w:t xml:space="preserve">. (2016).</w:t>
+      </w:r>
+      <w:r>
+        <w:t xml:space="preserve"> </w:t>
+      </w:r>
+      <w:r>
+        <w:rPr>
+          <w:b/>
+          <w:bCs/>
+          <w:i/>
+          <w:iCs/>
+        </w:rPr>
+        <w:t xml:space="preserve">Partnerships for Regional Invasive Species Management (PRISM)</w:t>
+      </w:r>
+      <w:r>
+        <w:rPr>
+          <w:b/>
+          <w:bCs/>
+        </w:rPr>
+        <w:t xml:space="preserve">.</w:t>
+      </w:r>
+      <w:r>
+        <w:br/>
+      </w:r>
+      <w:hyperlink r:id="rId33">
+        <w:r>
+          <w:rPr>
+            <w:rStyle w:val="Hyperlink"/>
+          </w:rPr>
+          <w:t xml:space="preserve">https://dec.ny.gov/nature/animals-fish-plants/invasive-species/resources-regulations/invasive-species-partners</w:t>
+        </w:r>
+      </w:hyperlink>
+    </w:p>
+    <w:p>
+      <w:pPr>
+        <w:pStyle w:val="BodyText"/>
+      </w:pPr>
+      <w:r>
+        <w:rPr>
+          <w:u w:val="single"/>
+        </w:rPr>
+        <w:t xml:space="preserve">New York Natural Heritage Program</w:t>
+      </w:r>
+      <w:r>
+        <w:t xml:space="preserve">. (2024).</w:t>
+      </w:r>
+      <w:r>
+        <w:t xml:space="preserve"> </w:t>
+      </w:r>
+      <w:r>
+        <w:rPr>
+          <w:b/>
+          <w:bCs/>
+          <w:i/>
+          <w:iCs/>
+        </w:rPr>
+        <w:t xml:space="preserve">Invasive Species Tiered Ranking System</w:t>
+      </w:r>
+      <w:r>
+        <w:rPr>
+          <w:b/>
+          <w:bCs/>
+        </w:rPr>
+        <w:t xml:space="preserve">.</w:t>
+      </w:r>
+      <w:r>
+        <w:br/>
+      </w:r>
+      <w:hyperlink r:id="rId34">
+        <w:r>
+          <w:rPr>
+            <w:rStyle w:val="Hyperlink"/>
+          </w:rPr>
+          <w:t xml:space="preserve">https://www.nynhp.org/invasives/species-tiers-table/</w:t>
+        </w:r>
+      </w:hyperlink>
+    </w:p>
+    <w:p>
+      <w:pPr>
+        <w:pStyle w:val="BodyText"/>
+      </w:pPr>
+      <w:r>
+        <w:t xml:space="preserve">Finley, D., Dovciak, M., &amp; Dean, J. (2023).</w:t>
+      </w:r>
+      <w:r>
+        <w:t xml:space="preserve"> </w:t>
+      </w:r>
+      <w:r>
+        <w:rPr>
+          <w:i/>
+          <w:iCs/>
+        </w:rPr>
+        <w:t xml:space="preserve">A data-driven method for prioritizing invasive species to aid policy and management</w:t>
+      </w:r>
+      <w:r>
+        <w:t xml:space="preserve">.</w:t>
+      </w:r>
+      <w:r>
+        <w:t xml:space="preserve"> </w:t>
+      </w:r>
+      <w:r>
+        <w:rPr>
+          <w:b/>
+          <w:bCs/>
+        </w:rPr>
+        <w:t xml:space="preserve">Biological Invasions</w:t>
+      </w:r>
+      <w:r>
+        <w:t xml:space="preserve">.</w:t>
+      </w:r>
+      <w:r>
+        <w:br/>
+      </w:r>
+      <w:hyperlink r:id="rId35">
+        <w:r>
+          <w:rPr>
+            <w:rStyle w:val="Hyperlink"/>
+          </w:rPr>
+          <w:t xml:space="preserve">https://link.springer.com/article/10.1007/s10530-023-03041-3</w:t>
+        </w:r>
+      </w:hyperlink>
+    </w:p>
+    <w:bookmarkEnd w:id="36"/>
+    <w:bookmarkStart w:id="50" w:name="section-1"/>
+    <w:p>
+      <w:pPr>
+        <w:pStyle w:val="Heading2"/>
+      </w:pPr>
+    </w:p>
+    <w:bookmarkStart w:id="49" w:name="refs"/>
+    <w:bookmarkStart w:id="37" w:name="ref-diagne2021"/>
     <w:p>
       <w:pPr>
         <w:pStyle w:val="Bibliography"/>
@@ -1145,8 +1562,8 @@
         <w:t xml:space="preserve">.</w:t>
       </w:r>
     </w:p>
-    <w:bookmarkEnd w:id="22"/>
-    <w:bookmarkStart w:id="23" w:name="ref-finley2023"/>
+    <w:bookmarkEnd w:id="37"/>
+    <w:bookmarkStart w:id="38" w:name="ref-finley2023"/>
     <w:p>
       <w:pPr>
         <w:pStyle w:val="Bibliography"/>
@@ -1174,8 +1591,8 @@
         <w:t xml:space="preserve">.</w:t>
       </w:r>
     </w:p>
-    <w:bookmarkEnd w:id="23"/>
-    <w:bookmarkStart w:id="24" w:name="ref-gentili2021"/>
+    <w:bookmarkEnd w:id="38"/>
+    <w:bookmarkStart w:id="39" w:name="ref-gentili2021"/>
     <w:p>
       <w:pPr>
         <w:pStyle w:val="Bibliography"/>
@@ -1203,8 +1620,8 @@
         <w:t xml:space="preserve">.</w:t>
       </w:r>
     </w:p>
-    <w:bookmarkEnd w:id="24"/>
-    <w:bookmarkStart w:id="25" w:name="ref-leung2002"/>
+    <w:bookmarkEnd w:id="39"/>
+    <w:bookmarkStart w:id="40" w:name="ref-leung2002"/>
     <w:p>
       <w:pPr>
         <w:pStyle w:val="Bibliography"/>
@@ -1232,8 +1649,8 @@
         <w:t xml:space="preserve">.</w:t>
       </w:r>
     </w:p>
-    <w:bookmarkEnd w:id="25"/>
-    <w:bookmarkStart w:id="26" w:name="ref-mack2000"/>
+    <w:bookmarkEnd w:id="40"/>
+    <w:bookmarkStart w:id="41" w:name="ref-mack2000"/>
     <w:p>
       <w:pPr>
         <w:pStyle w:val="Bibliography"/>
@@ -1261,8 +1678,8 @@
         <w:t xml:space="preserve">.</w:t>
       </w:r>
     </w:p>
-    <w:bookmarkEnd w:id="26"/>
-    <w:bookmarkStart w:id="28" w:name="ref-nynhp2024"/>
+    <w:bookmarkEnd w:id="41"/>
+    <w:bookmarkStart w:id="43" w:name="ref-nynhp2024"/>
     <w:p>
       <w:pPr>
         <w:pStyle w:val="Bibliography"/>
@@ -1279,7 +1696,7 @@
       <w:r>
         <w:t xml:space="preserve"> </w:t>
       </w:r>
-      <w:hyperlink r:id="rId27">
+      <w:hyperlink r:id="rId42">
         <w:r>
           <w:rPr>
             <w:rStyle w:val="Hyperlink"/>
@@ -1291,8 +1708,8 @@
         <w:t xml:space="preserve">.</w:t>
       </w:r>
     </w:p>
-    <w:bookmarkEnd w:id="28"/>
-    <w:bookmarkStart w:id="30" w:name="ref-nysdec2016"/>
+    <w:bookmarkEnd w:id="43"/>
+    <w:bookmarkStart w:id="45" w:name="ref-nysdec2016"/>
     <w:p>
       <w:pPr>
         <w:pStyle w:val="Bibliography"/>
@@ -1309,7 +1726,7 @@
       <w:r>
         <w:t xml:space="preserve"> </w:t>
       </w:r>
-      <w:hyperlink r:id="rId29">
+      <w:hyperlink r:id="rId44">
         <w:r>
           <w:rPr>
             <w:rStyle w:val="Hyperlink"/>
@@ -1321,8 +1738,8 @@
         <w:t xml:space="preserve">.</w:t>
       </w:r>
     </w:p>
-    <w:bookmarkEnd w:id="30"/>
-    <w:bookmarkStart w:id="31" w:name="ref-nysdec2024"/>
+    <w:bookmarkEnd w:id="45"/>
+    <w:bookmarkStart w:id="46" w:name="ref-nysdec2024"/>
     <w:p>
       <w:pPr>
         <w:pStyle w:val="Bibliography"/>
@@ -1339,7 +1756,7 @@
       <w:r>
         <w:t xml:space="preserve"> </w:t>
       </w:r>
-      <w:hyperlink r:id="rId29">
+      <w:hyperlink r:id="rId44">
         <w:r>
           <w:rPr>
             <w:rStyle w:val="Hyperlink"/>
@@ -1351,8 +1768,8 @@
         <w:t xml:space="preserve">.</w:t>
       </w:r>
     </w:p>
-    <w:bookmarkEnd w:id="31"/>
-    <w:bookmarkStart w:id="33" w:name="ref-usda2024"/>
+    <w:bookmarkEnd w:id="46"/>
+    <w:bookmarkStart w:id="48" w:name="ref-usda2024"/>
     <w:p>
       <w:pPr>
         <w:pStyle w:val="Bibliography"/>
@@ -1369,7 +1786,7 @@
       <w:r>
         <w:t xml:space="preserve"> </w:t>
       </w:r>
-      <w:hyperlink r:id="rId32">
+      <w:hyperlink r:id="rId47">
         <w:r>
           <w:rPr>
             <w:rStyle w:val="Hyperlink"/>
@@ -1381,10 +1798,9 @@
         <w:t xml:space="preserve">.</w:t>
       </w:r>
     </w:p>
-    <w:bookmarkEnd w:id="33"/>
-    <w:bookmarkEnd w:id="34"/>
-    <w:bookmarkEnd w:id="35"/>
-    <w:bookmarkEnd w:id="36"/>
+    <w:bookmarkEnd w:id="48"/>
+    <w:bookmarkEnd w:id="49"/>
+    <w:bookmarkEnd w:id="50"/>
     <w:sectPr>
       <w:footnotePr>
         <w:numRestart w:val="eachSect"/>

</xml_diff>